<commit_message>
docs: correct SHAMS PROJECT DBCA naming flow
</commit_message>
<xml_diff>
--- a/artifacts/shams_project/M24SHAMS_RUN_SHEET_STAGING_DATAGUARD.docx
+++ b/artifacts/shams_project/M24SHAMS_RUN_SHEET_STAGING_DATAGUARD.docx
@@ -1412,58 +1412,7 @@
     <w:p/>
     <w:p>
       <w:r>
-        <w:t>Chiudi i controlli:</w:t>
-      </w:r>
-    </w:p>
-    <w:p>
-      <w:r>
-        <w:t>SELECT name, db_unique_name, database_role, open_mode, log_mode, force_logging</w:t>
-      </w:r>
-    </w:p>
-    <w:p>
-      <w:r>
-        <w:t>FROM v$database;</w:t>
-      </w:r>
-    </w:p>
-    <w:p/>
-    <w:p>
-      <w:r>
-        <w:t>SELECT group#, thread#, bytes / 1024 / 1024 AS mb, status</w:t>
-      </w:r>
-    </w:p>
-    <w:p>
-      <w:r>
-        <w:t>FROM v$log</w:t>
-      </w:r>
-    </w:p>
-    <w:p>
-      <w:pPr>
-        <w:shd w:val="clear" w:color="auto" w:fill="F2F2F2"/>
-        <w:spacing w:after="80"/>
-        <w:rPr>
-          <w:rFonts w:ascii="Consolas" w:hAnsi="Consolas"/>
-          <w:sz w:val="14"/>
-        </w:rPr>
-      </w:pPr>
-      <w:r>
-        <w:rPr>
-          <w:rFonts w:ascii="Consolas" w:hAnsi="Consolas"/>
-          <w:sz w:val="14"/>
-        </w:rPr>
-        <w:t>ORDER BY group#;</w:t>
-      </w:r>
-    </w:p>
-    <w:p>
-      <w:pPr>
-        <w:pStyle w:val="Heading2"/>
-      </w:pPr>
-      <w:r>
-        <w:t>3. Prerequisiti Data Guard</w:t>
-      </w:r>
-    </w:p>
-    <w:p>
-      <w:r>
-        <w:t>Conferma:</w:t>
+        <w:t>Se usi DBCA GUI, inserisci prima:</w:t>
       </w:r>
     </w:p>
     <w:tbl>
@@ -1494,6 +1443,270 @@
                 <w:b/>
                 <w:sz w:val="15"/>
               </w:rPr>
+              <w:t>Campo DBCA primary PE</w:t>
+            </w:r>
+          </w:p>
+        </w:tc>
+        <w:tc>
+          <w:tcPr>
+            <w:tcW w:w="2500" w:type="pct"/>
+            <w:shd w:val="clear" w:color="auto" w:fill="E6E6E6"/>
+          </w:tcPr>
+          <w:p>
+            <w:pPr>
+              <w:rPr>
+                <w:b/>
+                <w:sz w:val="15"/>
+              </w:rPr>
+            </w:pPr>
+            <w:r>
+              <w:rPr>
+                <w:b/>
+                <w:sz w:val="15"/>
+              </w:rPr>
+              <w:t>Valore</w:t>
+            </w:r>
+          </w:p>
+        </w:tc>
+      </w:tr>
+      <w:tr>
+        <w:tc>
+          <w:tcPr>
+            <w:tcW w:w="2500" w:type="pct"/>
+          </w:tcPr>
+          <w:p>
+            <w:pPr>
+              <w:rPr>
+                <w:sz w:val="15"/>
+              </w:rPr>
+            </w:pPr>
+            <w:r>
+              <w:rPr>
+                <w:sz w:val="15"/>
+              </w:rPr>
+              <w:t>Global Database Name</w:t>
+            </w:r>
+          </w:p>
+        </w:tc>
+        <w:tc>
+          <w:tcPr>
+            <w:tcW w:w="2500" w:type="pct"/>
+          </w:tcPr>
+          <w:p>
+            <w:pPr>
+              <w:rPr>
+                <w:sz w:val="15"/>
+              </w:rPr>
+            </w:pPr>
+            <w:r>
+              <w:rPr>
+                <w:sz w:val="15"/>
+              </w:rPr>
+              <w:t>M24SHAMSPEC oppure M24SHAMSPEC.&lt;DB_DOMAIN&gt;</w:t>
+            </w:r>
+          </w:p>
+        </w:tc>
+      </w:tr>
+      <w:tr>
+        <w:tc>
+          <w:tcPr>
+            <w:tcW w:w="2500" w:type="pct"/>
+          </w:tcPr>
+          <w:p>
+            <w:pPr>
+              <w:rPr>
+                <w:sz w:val="15"/>
+              </w:rPr>
+            </w:pPr>
+            <w:r>
+              <w:rPr>
+                <w:sz w:val="15"/>
+              </w:rPr>
+              <w:t>SID</w:t>
+            </w:r>
+          </w:p>
+        </w:tc>
+        <w:tc>
+          <w:tcPr>
+            <w:tcW w:w="2500" w:type="pct"/>
+          </w:tcPr>
+          <w:p>
+            <w:pPr>
+              <w:rPr>
+                <w:sz w:val="15"/>
+              </w:rPr>
+            </w:pPr>
+            <w:r>
+              <w:rPr>
+                <w:sz w:val="15"/>
+              </w:rPr>
+              <w:t>M24SHAMSPEC</w:t>
+            </w:r>
+          </w:p>
+        </w:tc>
+      </w:tr>
+      <w:tr>
+        <w:tc>
+          <w:tcPr>
+            <w:tcW w:w="2500" w:type="pct"/>
+          </w:tcPr>
+          <w:p>
+            <w:pPr>
+              <w:rPr>
+                <w:sz w:val="15"/>
+              </w:rPr>
+            </w:pPr>
+            <w:r>
+              <w:rPr>
+                <w:sz w:val="15"/>
+              </w:rPr>
+              <w:t>All Initialization Parameters: DB_NAME</w:t>
+            </w:r>
+          </w:p>
+        </w:tc>
+        <w:tc>
+          <w:tcPr>
+            <w:tcW w:w="2500" w:type="pct"/>
+          </w:tcPr>
+          <w:p>
+            <w:pPr>
+              <w:rPr>
+                <w:sz w:val="15"/>
+              </w:rPr>
+            </w:pPr>
+            <w:r>
+              <w:rPr>
+                <w:sz w:val="15"/>
+              </w:rPr>
+              <w:t>M24SHAMS</w:t>
+            </w:r>
+          </w:p>
+        </w:tc>
+      </w:tr>
+      <w:tr>
+        <w:tc>
+          <w:tcPr>
+            <w:tcW w:w="2500" w:type="pct"/>
+          </w:tcPr>
+          <w:p>
+            <w:pPr>
+              <w:rPr>
+                <w:sz w:val="15"/>
+              </w:rPr>
+            </w:pPr>
+            <w:r>
+              <w:rPr>
+                <w:sz w:val="15"/>
+              </w:rPr>
+              <w:t>All Initialization Parameters: DB_UNIQUE_NAME</w:t>
+            </w:r>
+          </w:p>
+        </w:tc>
+        <w:tc>
+          <w:tcPr>
+            <w:tcW w:w="2500" w:type="pct"/>
+          </w:tcPr>
+          <w:p>
+            <w:pPr>
+              <w:rPr>
+                <w:sz w:val="15"/>
+              </w:rPr>
+            </w:pPr>
+            <w:r>
+              <w:rPr>
+                <w:sz w:val="15"/>
+              </w:rPr>
+              <w:t>M24SHAMSPEC</w:t>
+            </w:r>
+          </w:p>
+        </w:tc>
+      </w:tr>
+    </w:tbl>
+    <w:p/>
+    <w:p>
+      <w:r>
+        <w:t>Chiudi i controlli:</w:t>
+      </w:r>
+    </w:p>
+    <w:p>
+      <w:r>
+        <w:t>SELECT name, db_unique_name, database_role, open_mode, log_mode, force_logging</w:t>
+      </w:r>
+    </w:p>
+    <w:p>
+      <w:r>
+        <w:t>FROM v$database;</w:t>
+      </w:r>
+    </w:p>
+    <w:p/>
+    <w:p>
+      <w:r>
+        <w:t>SELECT group#, thread#, bytes / 1024 / 1024 AS mb, status</w:t>
+      </w:r>
+    </w:p>
+    <w:p>
+      <w:r>
+        <w:t>FROM v$log</w:t>
+      </w:r>
+    </w:p>
+    <w:p>
+      <w:pPr>
+        <w:shd w:val="clear" w:color="auto" w:fill="F2F2F2"/>
+        <w:spacing w:after="80"/>
+        <w:rPr>
+          <w:rFonts w:ascii="Consolas" w:hAnsi="Consolas"/>
+          <w:sz w:val="14"/>
+        </w:rPr>
+      </w:pPr>
+      <w:r>
+        <w:rPr>
+          <w:rFonts w:ascii="Consolas" w:hAnsi="Consolas"/>
+          <w:sz w:val="14"/>
+        </w:rPr>
+        <w:t>ORDER BY group#;</w:t>
+      </w:r>
+    </w:p>
+    <w:p>
+      <w:pPr>
+        <w:pStyle w:val="Heading2"/>
+      </w:pPr>
+      <w:r>
+        <w:t>3. Prerequisiti Data Guard</w:t>
+      </w:r>
+    </w:p>
+    <w:p>
+      <w:r>
+        <w:t>Conferma:</w:t>
+      </w:r>
+    </w:p>
+    <w:tbl>
+      <w:tblPr>
+        <w:tblStyle w:val="TableGrid"/>
+        <w:tblW w:w="5000" w:type="pct"/>
+        <w:tblLook w:val="04A0" w:firstRow="1" w:lastRow="0" w:firstColumn="1" w:lastColumn="0" w:noHBand="0" w:noVBand="1"/>
+      </w:tblPr>
+      <w:tblGrid>
+        <w:gridCol w:w="4988"/>
+        <w:gridCol w:w="4988"/>
+      </w:tblGrid>
+      <w:tr>
+        <w:tc>
+          <w:tcPr>
+            <w:tcW w:w="2500" w:type="pct"/>
+            <w:shd w:val="clear" w:color="auto" w:fill="E6E6E6"/>
+          </w:tcPr>
+          <w:p>
+            <w:pPr>
+              <w:rPr>
+                <w:b/>
+                <w:sz w:val="15"/>
+              </w:rPr>
+            </w:pPr>
+            <w:r>
+              <w:rPr>
+                <w:b/>
+                <w:sz w:val="15"/>
+              </w:rPr>
               <w:t>Controllo</w:t>
             </w:r>
           </w:p>
@@ -1574,6 +1787,82 @@
                 <w:sz w:val="15"/>
               </w:rPr>
               <w:t>primary DB_UNIQUE_NAME=M24SHAMSPEC</w:t>
+            </w:r>
+          </w:p>
+        </w:tc>
+        <w:tc>
+          <w:tcPr>
+            <w:tcW w:w="2500" w:type="pct"/>
+          </w:tcPr>
+          <w:p>
+            <w:pPr>
+              <w:rPr>
+                <w:sz w:val="15"/>
+              </w:rPr>
+            </w:pPr>
+            <w:r>
+              <w:rPr>
+                <w:sz w:val="15"/>
+              </w:rPr>
+              <w:t>&lt;OK/KO&gt;</w:t>
+            </w:r>
+          </w:p>
+        </w:tc>
+      </w:tr>
+      <w:tr>
+        <w:tc>
+          <w:tcPr>
+            <w:tcW w:w="2500" w:type="pct"/>
+          </w:tcPr>
+          <w:p>
+            <w:pPr>
+              <w:rPr>
+                <w:sz w:val="15"/>
+              </w:rPr>
+            </w:pPr>
+            <w:r>
+              <w:rPr>
+                <w:sz w:val="15"/>
+              </w:rPr>
+              <w:t>primary SID M24SHAMSPEC</w:t>
+            </w:r>
+          </w:p>
+        </w:tc>
+        <w:tc>
+          <w:tcPr>
+            <w:tcW w:w="2500" w:type="pct"/>
+          </w:tcPr>
+          <w:p>
+            <w:pPr>
+              <w:rPr>
+                <w:sz w:val="15"/>
+              </w:rPr>
+            </w:pPr>
+            <w:r>
+              <w:rPr>
+                <w:sz w:val="15"/>
+              </w:rPr>
+              <w:t>&lt;OK/KO&gt;</w:t>
+            </w:r>
+          </w:p>
+        </w:tc>
+      </w:tr>
+      <w:tr>
+        <w:tc>
+          <w:tcPr>
+            <w:tcW w:w="2500" w:type="pct"/>
+          </w:tcPr>
+          <w:p>
+            <w:pPr>
+              <w:rPr>
+                <w:sz w:val="15"/>
+              </w:rPr>
+            </w:pPr>
+            <w:r>
+              <w:rPr>
+                <w:sz w:val="15"/>
+              </w:rPr>
+              <w:t>standby SID M24SHAMSSEC</w:t>
             </w:r>
           </w:p>
         </w:tc>
@@ -4024,7 +4313,7 @@
     <w:link w:val="Heading1Char"/>
     <w:uiPriority w:val="9"/>
     <w:qFormat/>
-    <w:rsid w:val="003B2C71"/>
+    <w:rsid w:val="00134707"/>
     <w:pPr>
       <w:keepNext/>
       <w:keepLines/>
@@ -4046,7 +4335,7 @@
     <w:uiPriority w:val="9"/>
     <w:unhideWhenUsed/>
     <w:qFormat/>
-    <w:rsid w:val="003B2C71"/>
+    <w:rsid w:val="00134707"/>
     <w:pPr>
       <w:keepNext/>
       <w:keepLines/>
@@ -4069,7 +4358,7 @@
     <w:semiHidden/>
     <w:unhideWhenUsed/>
     <w:qFormat/>
-    <w:rsid w:val="003B2C71"/>
+    <w:rsid w:val="00134707"/>
     <w:pPr>
       <w:keepNext/>
       <w:keepLines/>
@@ -4092,7 +4381,7 @@
     <w:semiHidden/>
     <w:unhideWhenUsed/>
     <w:qFormat/>
-    <w:rsid w:val="003B2C71"/>
+    <w:rsid w:val="00134707"/>
     <w:pPr>
       <w:keepNext/>
       <w:keepLines/>
@@ -4115,7 +4404,7 @@
     <w:semiHidden/>
     <w:unhideWhenUsed/>
     <w:qFormat/>
-    <w:rsid w:val="003B2C71"/>
+    <w:rsid w:val="00134707"/>
     <w:pPr>
       <w:keepNext/>
       <w:keepLines/>
@@ -4136,7 +4425,7 @@
     <w:semiHidden/>
     <w:unhideWhenUsed/>
     <w:qFormat/>
-    <w:rsid w:val="003B2C71"/>
+    <w:rsid w:val="00134707"/>
     <w:pPr>
       <w:keepNext/>
       <w:keepLines/>
@@ -4159,7 +4448,7 @@
     <w:semiHidden/>
     <w:unhideWhenUsed/>
     <w:qFormat/>
-    <w:rsid w:val="003B2C71"/>
+    <w:rsid w:val="00134707"/>
     <w:pPr>
       <w:keepNext/>
       <w:keepLines/>
@@ -4180,7 +4469,7 @@
     <w:semiHidden/>
     <w:unhideWhenUsed/>
     <w:qFormat/>
-    <w:rsid w:val="003B2C71"/>
+    <w:rsid w:val="00134707"/>
     <w:pPr>
       <w:keepNext/>
       <w:keepLines/>
@@ -4203,7 +4492,7 @@
     <w:semiHidden/>
     <w:unhideWhenUsed/>
     <w:qFormat/>
-    <w:rsid w:val="003B2C71"/>
+    <w:rsid w:val="00134707"/>
     <w:pPr>
       <w:keepNext/>
       <w:keepLines/>
@@ -4247,7 +4536,7 @@
     <w:basedOn w:val="DefaultParagraphFont"/>
     <w:link w:val="Heading1"/>
     <w:uiPriority w:val="9"/>
-    <w:rsid w:val="003B2C71"/>
+    <w:rsid w:val="00134707"/>
     <w:rPr>
       <w:rFonts w:ascii="Aptos Display" w:eastAsiaTheme="majorEastAsia" w:hAnsi="Aptos Display" w:cstheme="majorBidi"/>
       <w:color w:val="003B75"/>
@@ -4260,7 +4549,7 @@
     <w:basedOn w:val="DefaultParagraphFont"/>
     <w:link w:val="Heading2"/>
     <w:uiPriority w:val="9"/>
-    <w:rsid w:val="003B2C71"/>
+    <w:rsid w:val="00134707"/>
     <w:rPr>
       <w:rFonts w:ascii="Aptos Display" w:eastAsiaTheme="majorEastAsia" w:hAnsi="Aptos Display" w:cstheme="majorBidi"/>
       <w:color w:val="003B75"/>
@@ -4273,7 +4562,7 @@
     <w:link w:val="Heading3"/>
     <w:uiPriority w:val="9"/>
     <w:semiHidden/>
-    <w:rsid w:val="003B2C71"/>
+    <w:rsid w:val="00134707"/>
     <w:rPr>
       <w:rFonts w:ascii="Aptos Display" w:eastAsiaTheme="majorEastAsia" w:hAnsi="Aptos Display" w:cstheme="majorBidi"/>
       <w:color w:val="003B75"/>
@@ -4287,7 +4576,7 @@
     <w:link w:val="Heading4"/>
     <w:uiPriority w:val="9"/>
     <w:semiHidden/>
-    <w:rsid w:val="003B2C71"/>
+    <w:rsid w:val="00134707"/>
     <w:rPr>
       <w:rFonts w:eastAsiaTheme="majorEastAsia" w:cstheme="majorBidi"/>
       <w:i/>
@@ -4301,7 +4590,7 @@
     <w:link w:val="Heading5"/>
     <w:uiPriority w:val="9"/>
     <w:semiHidden/>
-    <w:rsid w:val="003B2C71"/>
+    <w:rsid w:val="00134707"/>
     <w:rPr>
       <w:rFonts w:eastAsiaTheme="majorEastAsia" w:cstheme="majorBidi"/>
       <w:color w:val="0F4761" w:themeColor="accent1" w:themeShade="BF"/>
@@ -4313,7 +4602,7 @@
     <w:link w:val="Heading6"/>
     <w:uiPriority w:val="9"/>
     <w:semiHidden/>
-    <w:rsid w:val="003B2C71"/>
+    <w:rsid w:val="00134707"/>
     <w:rPr>
       <w:rFonts w:eastAsiaTheme="majorEastAsia" w:cstheme="majorBidi"/>
       <w:i/>
@@ -4327,7 +4616,7 @@
     <w:link w:val="Heading7"/>
     <w:uiPriority w:val="9"/>
     <w:semiHidden/>
-    <w:rsid w:val="003B2C71"/>
+    <w:rsid w:val="00134707"/>
     <w:rPr>
       <w:rFonts w:eastAsiaTheme="majorEastAsia" w:cstheme="majorBidi"/>
       <w:color w:val="595959" w:themeColor="text1" w:themeTint="A6"/>
@@ -4339,7 +4628,7 @@
     <w:link w:val="Heading8"/>
     <w:uiPriority w:val="9"/>
     <w:semiHidden/>
-    <w:rsid w:val="003B2C71"/>
+    <w:rsid w:val="00134707"/>
     <w:rPr>
       <w:rFonts w:eastAsiaTheme="majorEastAsia" w:cstheme="majorBidi"/>
       <w:i/>
@@ -4353,7 +4642,7 @@
     <w:link w:val="Heading9"/>
     <w:uiPriority w:val="9"/>
     <w:semiHidden/>
-    <w:rsid w:val="003B2C71"/>
+    <w:rsid w:val="00134707"/>
     <w:rPr>
       <w:rFonts w:eastAsiaTheme="majorEastAsia" w:cstheme="majorBidi"/>
       <w:color w:val="272727" w:themeColor="text1" w:themeTint="D8"/>
@@ -4366,7 +4655,7 @@
     <w:link w:val="TitleChar"/>
     <w:uiPriority w:val="10"/>
     <w:qFormat/>
-    <w:rsid w:val="003B2C71"/>
+    <w:rsid w:val="00134707"/>
     <w:pPr>
       <w:spacing w:before="120" w:line="240" w:lineRule="auto"/>
       <w:contextualSpacing/>
@@ -4385,7 +4674,7 @@
     <w:basedOn w:val="DefaultParagraphFont"/>
     <w:link w:val="Title"/>
     <w:uiPriority w:val="10"/>
-    <w:rsid w:val="003B2C71"/>
+    <w:rsid w:val="00134707"/>
     <w:rPr>
       <w:rFonts w:ascii="Aptos Display" w:eastAsiaTheme="majorEastAsia" w:hAnsi="Aptos Display" w:cstheme="majorBidi"/>
       <w:color w:val="003B75"/>
@@ -4402,7 +4691,7 @@
     <w:link w:val="SubtitleChar"/>
     <w:uiPriority w:val="11"/>
     <w:qFormat/>
-    <w:rsid w:val="003B2C71"/>
+    <w:rsid w:val="00134707"/>
     <w:pPr>
       <w:numPr>
         <w:ilvl w:val="1"/>
@@ -4421,7 +4710,7 @@
     <w:basedOn w:val="DefaultParagraphFont"/>
     <w:link w:val="Subtitle"/>
     <w:uiPriority w:val="11"/>
-    <w:rsid w:val="003B2C71"/>
+    <w:rsid w:val="00134707"/>
     <w:rPr>
       <w:rFonts w:eastAsiaTheme="majorEastAsia" w:cstheme="majorBidi"/>
       <w:color w:val="595959" w:themeColor="text1" w:themeTint="A6"/>
@@ -4437,7 +4726,7 @@
     <w:link w:val="QuoteChar"/>
     <w:uiPriority w:val="29"/>
     <w:qFormat/>
-    <w:rsid w:val="003B2C71"/>
+    <w:rsid w:val="00134707"/>
     <w:pPr>
       <w:spacing w:before="160"/>
       <w:jc w:val="center"/>
@@ -4453,7 +4742,7 @@
     <w:basedOn w:val="DefaultParagraphFont"/>
     <w:link w:val="Quote"/>
     <w:uiPriority w:val="29"/>
-    <w:rsid w:val="003B2C71"/>
+    <w:rsid w:val="00134707"/>
     <w:rPr>
       <w:i/>
       <w:iCs/>
@@ -4465,7 +4754,7 @@
     <w:basedOn w:val="Normal"/>
     <w:uiPriority w:val="34"/>
     <w:qFormat/>
-    <w:rsid w:val="003B2C71"/>
+    <w:rsid w:val="00134707"/>
     <w:pPr>
       <w:ind w:left="720"/>
       <w:contextualSpacing/>
@@ -4476,7 +4765,7 @@
     <w:basedOn w:val="DefaultParagraphFont"/>
     <w:uiPriority w:val="21"/>
     <w:qFormat/>
-    <w:rsid w:val="003B2C71"/>
+    <w:rsid w:val="00134707"/>
     <w:rPr>
       <w:i/>
       <w:iCs/>
@@ -4490,7 +4779,7 @@
     <w:link w:val="IntenseQuoteChar"/>
     <w:uiPriority w:val="30"/>
     <w:qFormat/>
-    <w:rsid w:val="003B2C71"/>
+    <w:rsid w:val="00134707"/>
     <w:pPr>
       <w:pBdr>
         <w:top w:val="single" w:sz="4" w:space="10" w:color="0F4761" w:themeColor="accent1" w:themeShade="BF"/>
@@ -4511,7 +4800,7 @@
     <w:basedOn w:val="DefaultParagraphFont"/>
     <w:link w:val="IntenseQuote"/>
     <w:uiPriority w:val="30"/>
-    <w:rsid w:val="003B2C71"/>
+    <w:rsid w:val="00134707"/>
     <w:rPr>
       <w:i/>
       <w:iCs/>
@@ -4523,7 +4812,7 @@
     <w:basedOn w:val="DefaultParagraphFont"/>
     <w:uiPriority w:val="32"/>
     <w:qFormat/>
-    <w:rsid w:val="003B2C71"/>
+    <w:rsid w:val="00134707"/>
     <w:rPr>
       <w:b/>
       <w:bCs/>
@@ -4538,7 +4827,7 @@
     <w:link w:val="HeaderChar"/>
     <w:uiPriority w:val="99"/>
     <w:unhideWhenUsed/>
-    <w:rsid w:val="003B2C71"/>
+    <w:rsid w:val="00134707"/>
     <w:pPr>
       <w:tabs>
         <w:tab w:val="center" w:pos="4513"/>
@@ -4552,7 +4841,7 @@
     <w:basedOn w:val="DefaultParagraphFont"/>
     <w:link w:val="Header"/>
     <w:uiPriority w:val="99"/>
-    <w:rsid w:val="003B2C71"/>
+    <w:rsid w:val="00134707"/>
     <w:rPr>
       <w:rFonts w:ascii="Aptos" w:hAnsi="Aptos"/>
       <w:sz w:val="18"/>
@@ -4564,7 +4853,7 @@
     <w:link w:val="FooterChar"/>
     <w:uiPriority w:val="99"/>
     <w:unhideWhenUsed/>
-    <w:rsid w:val="003B2C71"/>
+    <w:rsid w:val="00134707"/>
     <w:pPr>
       <w:tabs>
         <w:tab w:val="center" w:pos="4513"/>
@@ -4578,7 +4867,7 @@
     <w:basedOn w:val="DefaultParagraphFont"/>
     <w:link w:val="Footer"/>
     <w:uiPriority w:val="99"/>
-    <w:rsid w:val="003B2C71"/>
+    <w:rsid w:val="00134707"/>
     <w:rPr>
       <w:rFonts w:ascii="Aptos" w:hAnsi="Aptos"/>
       <w:sz w:val="18"/>
@@ -4588,7 +4877,7 @@
     <w:name w:val="Table Grid"/>
     <w:basedOn w:val="TableNormal"/>
     <w:uiPriority w:val="39"/>
-    <w:rsid w:val="003B2C71"/>
+    <w:rsid w:val="00134707"/>
     <w:pPr>
       <w:spacing w:after="0" w:line="240" w:lineRule="auto"/>
     </w:pPr>

</xml_diff>

<commit_message>
docs: add SHAMS DBCA GUI audit checklist
</commit_message>
<xml_diff>
--- a/artifacts/shams_project/M24SHAMS_RUN_SHEET_STAGING_DATAGUARD.docx
+++ b/artifacts/shams_project/M24SHAMS_RUN_SHEET_STAGING_DATAGUARD.docx
@@ -4313,7 +4313,7 @@
     <w:link w:val="Heading1Char"/>
     <w:uiPriority w:val="9"/>
     <w:qFormat/>
-    <w:rsid w:val="00134707"/>
+    <w:rsid w:val="00D5610F"/>
     <w:pPr>
       <w:keepNext/>
       <w:keepLines/>
@@ -4335,7 +4335,7 @@
     <w:uiPriority w:val="9"/>
     <w:unhideWhenUsed/>
     <w:qFormat/>
-    <w:rsid w:val="00134707"/>
+    <w:rsid w:val="00D5610F"/>
     <w:pPr>
       <w:keepNext/>
       <w:keepLines/>
@@ -4358,7 +4358,7 @@
     <w:semiHidden/>
     <w:unhideWhenUsed/>
     <w:qFormat/>
-    <w:rsid w:val="00134707"/>
+    <w:rsid w:val="00D5610F"/>
     <w:pPr>
       <w:keepNext/>
       <w:keepLines/>
@@ -4381,7 +4381,7 @@
     <w:semiHidden/>
     <w:unhideWhenUsed/>
     <w:qFormat/>
-    <w:rsid w:val="00134707"/>
+    <w:rsid w:val="00D5610F"/>
     <w:pPr>
       <w:keepNext/>
       <w:keepLines/>
@@ -4404,7 +4404,7 @@
     <w:semiHidden/>
     <w:unhideWhenUsed/>
     <w:qFormat/>
-    <w:rsid w:val="00134707"/>
+    <w:rsid w:val="00D5610F"/>
     <w:pPr>
       <w:keepNext/>
       <w:keepLines/>
@@ -4425,7 +4425,7 @@
     <w:semiHidden/>
     <w:unhideWhenUsed/>
     <w:qFormat/>
-    <w:rsid w:val="00134707"/>
+    <w:rsid w:val="00D5610F"/>
     <w:pPr>
       <w:keepNext/>
       <w:keepLines/>
@@ -4448,7 +4448,7 @@
     <w:semiHidden/>
     <w:unhideWhenUsed/>
     <w:qFormat/>
-    <w:rsid w:val="00134707"/>
+    <w:rsid w:val="00D5610F"/>
     <w:pPr>
       <w:keepNext/>
       <w:keepLines/>
@@ -4469,7 +4469,7 @@
     <w:semiHidden/>
     <w:unhideWhenUsed/>
     <w:qFormat/>
-    <w:rsid w:val="00134707"/>
+    <w:rsid w:val="00D5610F"/>
     <w:pPr>
       <w:keepNext/>
       <w:keepLines/>
@@ -4492,7 +4492,7 @@
     <w:semiHidden/>
     <w:unhideWhenUsed/>
     <w:qFormat/>
-    <w:rsid w:val="00134707"/>
+    <w:rsid w:val="00D5610F"/>
     <w:pPr>
       <w:keepNext/>
       <w:keepLines/>
@@ -4536,7 +4536,7 @@
     <w:basedOn w:val="DefaultParagraphFont"/>
     <w:link w:val="Heading1"/>
     <w:uiPriority w:val="9"/>
-    <w:rsid w:val="00134707"/>
+    <w:rsid w:val="00D5610F"/>
     <w:rPr>
       <w:rFonts w:ascii="Aptos Display" w:eastAsiaTheme="majorEastAsia" w:hAnsi="Aptos Display" w:cstheme="majorBidi"/>
       <w:color w:val="003B75"/>
@@ -4549,7 +4549,7 @@
     <w:basedOn w:val="DefaultParagraphFont"/>
     <w:link w:val="Heading2"/>
     <w:uiPriority w:val="9"/>
-    <w:rsid w:val="00134707"/>
+    <w:rsid w:val="00D5610F"/>
     <w:rPr>
       <w:rFonts w:ascii="Aptos Display" w:eastAsiaTheme="majorEastAsia" w:hAnsi="Aptos Display" w:cstheme="majorBidi"/>
       <w:color w:val="003B75"/>
@@ -4562,7 +4562,7 @@
     <w:link w:val="Heading3"/>
     <w:uiPriority w:val="9"/>
     <w:semiHidden/>
-    <w:rsid w:val="00134707"/>
+    <w:rsid w:val="00D5610F"/>
     <w:rPr>
       <w:rFonts w:ascii="Aptos Display" w:eastAsiaTheme="majorEastAsia" w:hAnsi="Aptos Display" w:cstheme="majorBidi"/>
       <w:color w:val="003B75"/>
@@ -4576,7 +4576,7 @@
     <w:link w:val="Heading4"/>
     <w:uiPriority w:val="9"/>
     <w:semiHidden/>
-    <w:rsid w:val="00134707"/>
+    <w:rsid w:val="00D5610F"/>
     <w:rPr>
       <w:rFonts w:eastAsiaTheme="majorEastAsia" w:cstheme="majorBidi"/>
       <w:i/>
@@ -4590,7 +4590,7 @@
     <w:link w:val="Heading5"/>
     <w:uiPriority w:val="9"/>
     <w:semiHidden/>
-    <w:rsid w:val="00134707"/>
+    <w:rsid w:val="00D5610F"/>
     <w:rPr>
       <w:rFonts w:eastAsiaTheme="majorEastAsia" w:cstheme="majorBidi"/>
       <w:color w:val="0F4761" w:themeColor="accent1" w:themeShade="BF"/>
@@ -4602,7 +4602,7 @@
     <w:link w:val="Heading6"/>
     <w:uiPriority w:val="9"/>
     <w:semiHidden/>
-    <w:rsid w:val="00134707"/>
+    <w:rsid w:val="00D5610F"/>
     <w:rPr>
       <w:rFonts w:eastAsiaTheme="majorEastAsia" w:cstheme="majorBidi"/>
       <w:i/>
@@ -4616,7 +4616,7 @@
     <w:link w:val="Heading7"/>
     <w:uiPriority w:val="9"/>
     <w:semiHidden/>
-    <w:rsid w:val="00134707"/>
+    <w:rsid w:val="00D5610F"/>
     <w:rPr>
       <w:rFonts w:eastAsiaTheme="majorEastAsia" w:cstheme="majorBidi"/>
       <w:color w:val="595959" w:themeColor="text1" w:themeTint="A6"/>
@@ -4628,7 +4628,7 @@
     <w:link w:val="Heading8"/>
     <w:uiPriority w:val="9"/>
     <w:semiHidden/>
-    <w:rsid w:val="00134707"/>
+    <w:rsid w:val="00D5610F"/>
     <w:rPr>
       <w:rFonts w:eastAsiaTheme="majorEastAsia" w:cstheme="majorBidi"/>
       <w:i/>
@@ -4642,7 +4642,7 @@
     <w:link w:val="Heading9"/>
     <w:uiPriority w:val="9"/>
     <w:semiHidden/>
-    <w:rsid w:val="00134707"/>
+    <w:rsid w:val="00D5610F"/>
     <w:rPr>
       <w:rFonts w:eastAsiaTheme="majorEastAsia" w:cstheme="majorBidi"/>
       <w:color w:val="272727" w:themeColor="text1" w:themeTint="D8"/>
@@ -4655,7 +4655,7 @@
     <w:link w:val="TitleChar"/>
     <w:uiPriority w:val="10"/>
     <w:qFormat/>
-    <w:rsid w:val="00134707"/>
+    <w:rsid w:val="00D5610F"/>
     <w:pPr>
       <w:spacing w:before="120" w:line="240" w:lineRule="auto"/>
       <w:contextualSpacing/>
@@ -4674,7 +4674,7 @@
     <w:basedOn w:val="DefaultParagraphFont"/>
     <w:link w:val="Title"/>
     <w:uiPriority w:val="10"/>
-    <w:rsid w:val="00134707"/>
+    <w:rsid w:val="00D5610F"/>
     <w:rPr>
       <w:rFonts w:ascii="Aptos Display" w:eastAsiaTheme="majorEastAsia" w:hAnsi="Aptos Display" w:cstheme="majorBidi"/>
       <w:color w:val="003B75"/>
@@ -4691,7 +4691,7 @@
     <w:link w:val="SubtitleChar"/>
     <w:uiPriority w:val="11"/>
     <w:qFormat/>
-    <w:rsid w:val="00134707"/>
+    <w:rsid w:val="00D5610F"/>
     <w:pPr>
       <w:numPr>
         <w:ilvl w:val="1"/>
@@ -4710,7 +4710,7 @@
     <w:basedOn w:val="DefaultParagraphFont"/>
     <w:link w:val="Subtitle"/>
     <w:uiPriority w:val="11"/>
-    <w:rsid w:val="00134707"/>
+    <w:rsid w:val="00D5610F"/>
     <w:rPr>
       <w:rFonts w:eastAsiaTheme="majorEastAsia" w:cstheme="majorBidi"/>
       <w:color w:val="595959" w:themeColor="text1" w:themeTint="A6"/>
@@ -4726,7 +4726,7 @@
     <w:link w:val="QuoteChar"/>
     <w:uiPriority w:val="29"/>
     <w:qFormat/>
-    <w:rsid w:val="00134707"/>
+    <w:rsid w:val="00D5610F"/>
     <w:pPr>
       <w:spacing w:before="160"/>
       <w:jc w:val="center"/>
@@ -4742,7 +4742,7 @@
     <w:basedOn w:val="DefaultParagraphFont"/>
     <w:link w:val="Quote"/>
     <w:uiPriority w:val="29"/>
-    <w:rsid w:val="00134707"/>
+    <w:rsid w:val="00D5610F"/>
     <w:rPr>
       <w:i/>
       <w:iCs/>
@@ -4754,7 +4754,7 @@
     <w:basedOn w:val="Normal"/>
     <w:uiPriority w:val="34"/>
     <w:qFormat/>
-    <w:rsid w:val="00134707"/>
+    <w:rsid w:val="00D5610F"/>
     <w:pPr>
       <w:ind w:left="720"/>
       <w:contextualSpacing/>
@@ -4765,7 +4765,7 @@
     <w:basedOn w:val="DefaultParagraphFont"/>
     <w:uiPriority w:val="21"/>
     <w:qFormat/>
-    <w:rsid w:val="00134707"/>
+    <w:rsid w:val="00D5610F"/>
     <w:rPr>
       <w:i/>
       <w:iCs/>
@@ -4779,7 +4779,7 @@
     <w:link w:val="IntenseQuoteChar"/>
     <w:uiPriority w:val="30"/>
     <w:qFormat/>
-    <w:rsid w:val="00134707"/>
+    <w:rsid w:val="00D5610F"/>
     <w:pPr>
       <w:pBdr>
         <w:top w:val="single" w:sz="4" w:space="10" w:color="0F4761" w:themeColor="accent1" w:themeShade="BF"/>
@@ -4800,7 +4800,7 @@
     <w:basedOn w:val="DefaultParagraphFont"/>
     <w:link w:val="IntenseQuote"/>
     <w:uiPriority w:val="30"/>
-    <w:rsid w:val="00134707"/>
+    <w:rsid w:val="00D5610F"/>
     <w:rPr>
       <w:i/>
       <w:iCs/>
@@ -4812,7 +4812,7 @@
     <w:basedOn w:val="DefaultParagraphFont"/>
     <w:uiPriority w:val="32"/>
     <w:qFormat/>
-    <w:rsid w:val="00134707"/>
+    <w:rsid w:val="00D5610F"/>
     <w:rPr>
       <w:b/>
       <w:bCs/>
@@ -4827,7 +4827,7 @@
     <w:link w:val="HeaderChar"/>
     <w:uiPriority w:val="99"/>
     <w:unhideWhenUsed/>
-    <w:rsid w:val="00134707"/>
+    <w:rsid w:val="00D5610F"/>
     <w:pPr>
       <w:tabs>
         <w:tab w:val="center" w:pos="4513"/>
@@ -4841,7 +4841,7 @@
     <w:basedOn w:val="DefaultParagraphFont"/>
     <w:link w:val="Header"/>
     <w:uiPriority w:val="99"/>
-    <w:rsid w:val="00134707"/>
+    <w:rsid w:val="00D5610F"/>
     <w:rPr>
       <w:rFonts w:ascii="Aptos" w:hAnsi="Aptos"/>
       <w:sz w:val="18"/>
@@ -4853,7 +4853,7 @@
     <w:link w:val="FooterChar"/>
     <w:uiPriority w:val="99"/>
     <w:unhideWhenUsed/>
-    <w:rsid w:val="00134707"/>
+    <w:rsid w:val="00D5610F"/>
     <w:pPr>
       <w:tabs>
         <w:tab w:val="center" w:pos="4513"/>
@@ -4867,7 +4867,7 @@
     <w:basedOn w:val="DefaultParagraphFont"/>
     <w:link w:val="Footer"/>
     <w:uiPriority w:val="99"/>
-    <w:rsid w:val="00134707"/>
+    <w:rsid w:val="00D5610F"/>
     <w:rPr>
       <w:rFonts w:ascii="Aptos" w:hAnsi="Aptos"/>
       <w:sz w:val="18"/>
@@ -4877,7 +4877,7 @@
     <w:name w:val="Table Grid"/>
     <w:basedOn w:val="TableNormal"/>
     <w:uiPriority w:val="39"/>
-    <w:rsid w:val="00134707"/>
+    <w:rsid w:val="00D5610F"/>
     <w:pPr>
       <w:spacing w:after="0" w:line="240" w:lineRule="auto"/>
     </w:pPr>

</xml_diff>